<commit_message>
EP2: retriever semantico TF-IDF con metricas (IE4), replanificacion y priorizacion en el planificador (IE5), 38 pruebas y 11 escenarios de demo
- src/buscar_contexto.py: similitud coseno TF-IDF + normalizacion morfologica,
  embeddings densos opcionales y evaluar_recuperacion() (hit-rate@k, MRR).
- src/planificador.py: criticidad + priorizar() y replanificacion ante items
  invalidos (descarta y continua) con decision REPLANIFICACION.
- src/herramientas/escritura.py: parser tolerante (_parse_items_tolerante).
- tests: test_recuperacion.py + pruebas de replanificacion/priorizacion (29 -> 38).
- scripts/demo.py: escenarios de error/entrada ambigua y metricas del retriever (9 -> 11).
- Presentacion: PPT 10 -> 13 slides (metricas IE4, justificacion IE9, retos).
- README, informe (docx/md), guion y notebook Colab actualizados.
</commit_message>
<xml_diff>
--- a/informe/Informe_Tecnico_EP2_Ferrandes.docx
+++ b/informe/Informe_Tecnico_EP2_Ferrandes.docx
@@ -407,7 +407,7 @@
         <w:ind w:left="283"/>
       </w:pPr>
       <w:r>
-        <w:t>Recuperación semántica: retriever por palabras clave sobre el corpus documental (catálogo, políticas, FAQs), equivalente al mock de embeddings de la EP1; en producción se sustituye por Chroma/FAISS con embeddings.</w:t>
+        <w:t>Recuperación semántica: retriever con similitud coseno sobre vectores TF-IDF (ponderación por frecuencia inversa de documento y normalización morfológica ligera), con soporte opcional de embeddings densos (sentence-transformers). Se mide su calidad con un conjunto etiquetado de consultas: hit-rate@3 y MRR.</w:t>
       </w:r>
     </w:p>
     <w:p>
@@ -423,7 +423,7 @@
         <w:spacing w:after="80"/>
       </w:pPr>
       <w:r>
-        <w:t>El planificador (src/planificador.py) genera un esquema priorizado de 6 etapas para todo pedido: analizar solicitud → validar stock → reposición → cotizar → evaluar crédito → decisión final. Durante la ejecución se inyectan pasos adaptativos cuando el entorno cambia: faltantes de stock generan órdenes de reposición automáticas; montos que superan cupo o umbral bloquean el pedido y escalan a un vendedor vía ticket; clientes nuevos pagan contra entrega; consultas normativas se derivan a un especialista (guardrail). Cada decisión se registra con su justificación, lo que permite trazabilidad y auditoría.</w:t>
+        <w:t>El planificador (src/planificador.py) genera un esquema priorizado de 6 etapas para todo pedido: analizar solicitud → validar stock → reposición → cotizar → evaluar crédito → decisión final. Durante la ejecución se inyectan pasos adaptativos cuando el entorno cambia: faltantes de stock generan órdenes de reposición automáticas; montos que superan cupo o umbral bloquean el pedido y escalan a un vendedor vía ticket; clientes nuevos pagan contra entrega; consultas normativas se derivan a un especialista (guardrail). El plan expone además una priorización explícita por criticidad y una etapa de replanificación: si la solicitud trae ítems inválidos (producto inexistente o cantidad no válida), el agente los descarta, lo informa y continúa con los válidos en lugar de abortar. Cada decisión se registra con su justificación, lo que permite trazabilidad y auditoría.</w:t>
       </w:r>
     </w:p>
     <w:p>
@@ -972,13 +972,129 @@
           </w:p>
         </w:tc>
       </w:tr>
+      <w:tr>
+        <w:tc>
+          <w:tcPr>
+            <w:tcW w:type="dxa" w:w="2494"/>
+          </w:tcPr>
+          <w:p>
+            <w:r/>
+            <w:r>
+              <w:rPr>
+                <w:sz w:val="17"/>
+              </w:rPr>
+              <w:t>H. Ítems inválidos (FIJ-999, ELE-001:0)</w:t>
+            </w:r>
+          </w:p>
+        </w:tc>
+        <w:tc>
+          <w:tcPr>
+            <w:tcW w:type="dxa" w:w="1474"/>
+          </w:tcPr>
+          <w:p>
+            <w:r/>
+            <w:r>
+              <w:rPr>
+                <w:sz w:val="17"/>
+              </w:rPr>
+              <w:t>entrada inválida</w:t>
+            </w:r>
+          </w:p>
+        </w:tc>
+        <w:tc>
+          <w:tcPr>
+            <w:tcW w:type="dxa" w:w="3855"/>
+          </w:tcPr>
+          <w:p>
+            <w:r/>
+            <w:r>
+              <w:rPr>
+                <w:sz w:val="17"/>
+              </w:rPr>
+              <w:t>replanifica: descarta inválidos y continúa</w:t>
+            </w:r>
+          </w:p>
+        </w:tc>
+        <w:tc>
+          <w:tcPr>
+            <w:tcW w:type="dxa" w:w="1701"/>
+          </w:tcPr>
+          <w:p>
+            <w:r/>
+            <w:r>
+              <w:rPr>
+                <w:sz w:val="17"/>
+              </w:rPr>
+              <w:t>PEDIDO_CONFIRMADO</w:t>
+            </w:r>
+          </w:p>
+        </w:tc>
+      </w:tr>
+      <w:tr>
+        <w:tc>
+          <w:tcPr>
+            <w:tcW w:type="dxa" w:w="2494"/>
+          </w:tcPr>
+          <w:p>
+            <w:r/>
+            <w:r>
+              <w:rPr>
+                <w:sz w:val="17"/>
+              </w:rPr>
+              <w:t>H2. Producto inexistente TOR-999</w:t>
+            </w:r>
+          </w:p>
+        </w:tc>
+        <w:tc>
+          <w:tcPr>
+            <w:tcW w:type="dxa" w:w="1474"/>
+          </w:tcPr>
+          <w:p>
+            <w:r/>
+            <w:r>
+              <w:rPr>
+                <w:sz w:val="17"/>
+              </w:rPr>
+              <w:t>entrada ambigua</w:t>
+            </w:r>
+          </w:p>
+        </w:tc>
+        <w:tc>
+          <w:tcPr>
+            <w:tcW w:type="dxa" w:w="3855"/>
+          </w:tcPr>
+          <w:p>
+            <w:r/>
+            <w:r>
+              <w:rPr>
+                <w:sz w:val="17"/>
+              </w:rPr>
+              <w:t>responde que no existe, sin inventar</w:t>
+            </w:r>
+          </w:p>
+        </w:tc>
+        <w:tc>
+          <w:tcPr>
+            <w:tcW w:type="dxa" w:w="1701"/>
+          </w:tcPr>
+          <w:p>
+            <w:r/>
+            <w:r>
+              <w:rPr>
+                <w:sz w:val="17"/>
+              </w:rPr>
+              <w:t>CONTROLADO</w:t>
+            </w:r>
+          </w:p>
+        </w:tc>
+      </w:tr>
     </w:tbl>
     <w:p>
       <w:pPr>
         <w:spacing w:after="80"/>
       </w:pPr>
       <w:r>
-        <w:t>La ejecución completa y el log por consulta están en evidencia/ y en el log logs_agente.jsonl del repositorio; el smoke test del grafo LangChain se incluye en evidencia/evidencia_langchain.txt. 29 pruebas unitarias validadas (tests/ejecutar_tests.py).</w:t>
+        <w:t>La ejecución completa y el log por consulta están en evidencia/ y en el log logs_agente.jsonl del repositorio; el smoke test del grafo LangChain se incluye en evidencia/evidencia_langchain.txt. 38 pruebas unitarias validadas (tests/ejecutar_tests.py) y retriever con hit-rate@3 = 100 % sobre 8 consultas etiquetadas.</w:t>
       </w:r>
     </w:p>
     <w:p>
@@ -1133,7 +1249,7 @@
               <w:rPr>
                 <w:sz w:val="17"/>
               </w:rPr>
-              <w:t>Retriever por palabras clave</w:t>
+              <w:t>Retriever semántico TF-IDF</w:t>
             </w:r>
           </w:p>
         </w:tc>
@@ -1147,7 +1263,7 @@
               <w:rPr>
                 <w:sz w:val="17"/>
               </w:rPr>
-              <w:t>Reutiliza la estrategia de la EP1 (mock de embeddings); evidencia la continuidad del proyecto.</w:t>
+              <w:t>Similitud coseno TF-IDF con normalización morfológica; mejora la precisión frente al conteo de palabras clave y admite embeddings densos sin cambiar la interfaz.</w:t>
             </w:r>
           </w:p>
         </w:tc>
@@ -1177,7 +1293,7 @@
               <w:rPr>
                 <w:sz w:val="17"/>
               </w:rPr>
-              <w:t>Cumple IL5/IE5: plan priorizado y comportamiento dinámico ante condiciones cambiantes.</w:t>
+              <w:t>Cumple IL5/IE5: plan priorizado por criticidad, comportamiento dinámico y replanificación ante entradas inválidas.</w:t>
             </w:r>
           </w:p>
         </w:tc>

</xml_diff>